<commit_message>
Added PCB project files and research document, updated logbook
</commit_message>
<xml_diff>
--- a/Onboarding Project Research.docx
+++ b/Onboarding Project Research.docx
@@ -56,13 +56,37 @@
         <w:rPr>
           <w:lang w:val="en-GB"/>
         </w:rPr>
-        <w:t>and other telemetry data.</w:t>
-      </w:r>
-      <w:r>
-        <w:rPr>
-          <w:lang w:val="en-GB"/>
-        </w:rPr>
-        <w:t xml:space="preserve"> To test what sort of storage quantities would be needed I performed some tests, creating a variety of sample images</w:t>
+        <w:t>and other telemetry data</w:t>
+      </w:r>
+      <w:r>
+        <w:rPr>
+          <w:lang w:val="en-GB"/>
+        </w:rPr>
+        <w:t xml:space="preserve"> as well as being a buffer for data being transmitted</w:t>
+      </w:r>
+      <w:r>
+        <w:rPr>
+          <w:lang w:val="en-GB"/>
+        </w:rPr>
+        <w:t>.</w:t>
+      </w:r>
+      <w:r>
+        <w:rPr>
+          <w:lang w:val="en-GB"/>
+        </w:rPr>
+        <w:t xml:space="preserve"> To test what sort of storage quantities would be needed</w:t>
+      </w:r>
+      <w:r>
+        <w:rPr>
+          <w:lang w:val="en-GB"/>
+        </w:rPr>
+        <w:t>,</w:t>
+      </w:r>
+      <w:r>
+        <w:rPr>
+          <w:lang w:val="en-GB"/>
+        </w:rPr>
+        <w:t xml:space="preserve"> I performed some tests, creating a variety of sample images</w:t>
       </w:r>
       <w:r>
         <w:rPr>
@@ -92,49 +116,37 @@
         <w:rPr>
           <w:lang w:val="en-GB"/>
         </w:rPr>
-        <w:t xml:space="preserve">. </w:t>
-      </w:r>
-      <w:r>
-        <w:rPr>
-          <w:lang w:val="en-GB"/>
-        </w:rPr>
-        <w:t xml:space="preserve">From this I’ve chosen a target minimum storage of </w:t>
-      </w:r>
-      <w:r>
-        <w:rPr>
-          <w:lang w:val="en-GB"/>
-        </w:rPr>
-        <w:t>128MB</w:t>
-      </w:r>
-      <w:r>
-        <w:rPr>
-          <w:lang w:val="en-GB"/>
-        </w:rPr>
-        <w:t xml:space="preserve">, with ideal capacities at </w:t>
-      </w:r>
-      <w:r>
-        <w:rPr>
-          <w:lang w:val="en-GB"/>
-        </w:rPr>
-        <w:t>1</w:t>
-      </w:r>
-      <w:r>
-        <w:rPr>
-          <w:lang w:val="en-GB"/>
-        </w:rPr>
-        <w:t>GB and above</w:t>
-      </w:r>
-      <w:r>
-        <w:rPr>
-          <w:lang w:val="en-GB"/>
-        </w:rPr>
-        <w:t xml:space="preserve"> if possible</w:t>
-      </w:r>
-      <w:r>
-        <w:rPr>
-          <w:lang w:val="en-GB"/>
-        </w:rPr>
         <w:t>.</w:t>
+      </w:r>
+      <w:r>
+        <w:rPr>
+          <w:lang w:val="en-GB"/>
+        </w:rPr>
+        <w:t xml:space="preserve"> From this I determined that it would be ideal to have a storage size of about </w:t>
+      </w:r>
+      <w:r>
+        <w:rPr>
+          <w:lang w:val="en-GB"/>
+        </w:rPr>
+        <w:t>256-512Mb</w:t>
+      </w:r>
+      <w:r>
+        <w:rPr>
+          <w:lang w:val="en-GB"/>
+        </w:rPr>
+        <w:t xml:space="preserve"> and have </w:t>
+      </w:r>
+      <w:r>
+        <w:rPr>
+          <w:lang w:val="en-GB"/>
+        </w:rPr>
+        <w:t>1Gb</w:t>
+      </w:r>
+      <w:r>
+        <w:rPr>
+          <w:lang w:val="en-GB"/>
+        </w:rPr>
+        <w:t xml:space="preserve"> as a possible option in future.</w:t>
       </w:r>
     </w:p>
     <w:p>
@@ -383,14 +395,32 @@
         <w:rPr>
           <w:lang w:val="en-GB"/>
         </w:rPr>
-        <w:t xml:space="preserve">byte. Current draw is also low compared to NAND. It is however more expensive by a fairly significant margin and higher capacity ICs are just simply not available in many cases and it is </w:t>
+        <w:t xml:space="preserve">byte. Current draw is also low compared to NAND. It is however more expensive </w:t>
+      </w:r>
+      <w:r>
+        <w:rPr>
+          <w:lang w:val="en-GB"/>
+        </w:rPr>
+        <w:t>per unit capacity</w:t>
+      </w:r>
+      <w:r>
+        <w:rPr>
+          <w:lang w:val="en-GB"/>
+        </w:rPr>
+        <w:t xml:space="preserve"> </w:t>
+      </w:r>
+      <w:r>
+        <w:rPr>
+          <w:lang w:val="en-GB"/>
+        </w:rPr>
+        <w:t xml:space="preserve">and </w:t>
       </w:r>
       <w:r>
         <w:rPr>
           <w:lang w:val="en-GB"/>
         </w:rPr>
         <w:lastRenderedPageBreak/>
-        <w:t>slower when writing and reading sequentially.</w:t>
+        <w:t>higher capacity ICs are just simply not available in many cases and it is slower when writing and reading sequentially.</w:t>
       </w:r>
       <w:r>
         <w:rPr>
@@ -408,19 +438,49 @@
         <w:rPr>
           <w:lang w:val="en-GB"/>
         </w:rPr>
-        <w:t xml:space="preserve"> ideal minimum of around </w:t>
-      </w:r>
-      <w:r>
-        <w:rPr>
-          <w:lang w:val="en-GB"/>
-        </w:rPr>
-        <w:t xml:space="preserve">128MB, I have chosen a few different ICs with some </w:t>
+        <w:t xml:space="preserve"> ideal minimum of around</w:t>
+      </w:r>
+      <w:r>
+        <w:rPr>
+          <w:lang w:val="en-GB"/>
+        </w:rPr>
+        <w:t xml:space="preserve"> </w:t>
+      </w:r>
+      <w:r>
+        <w:rPr>
+          <w:lang w:val="en-GB"/>
+        </w:rPr>
+        <w:t>512Mb</w:t>
+      </w:r>
+      <w:r>
+        <w:rPr>
+          <w:lang w:val="en-GB"/>
+        </w:rPr>
+        <w:t xml:space="preserve">, I have chosen a few different ICs with some </w:t>
       </w:r>
       <w:r>
         <w:rPr>
           <w:lang w:val="en-GB"/>
         </w:rPr>
         <w:t xml:space="preserve">different communication options </w:t>
+      </w:r>
+      <w:r>
+        <w:rPr>
+          <w:lang w:val="en-GB"/>
+        </w:rPr>
+        <w:t>such as SPI, QSPI, and Parallel to determine what would be ideal for this use case.</w:t>
+      </w:r>
+      <w:r>
+        <w:rPr>
+          <w:lang w:val="en-GB"/>
+        </w:rPr>
+        <w:t xml:space="preserve"> </w:t>
+      </w:r>
+      <w:r>
+        <w:rPr>
+          <w:lang w:val="en-GB"/>
+        </w:rPr>
+        <w:t>I’ve chosen to look at 512Mb NOR Flash modules and 1Gb NAND modules.</w:t>
       </w:r>
     </w:p>
     <w:p>
@@ -443,37 +503,6 @@
     <w:p>
       <w:pPr>
         <w:rPr>
-          <w:lang w:val="en-GB"/>
-        </w:rPr>
-      </w:pPr>
-      <w:r>
-        <w:rPr>
-          <w:lang w:val="en-GB"/>
-        </w:rPr>
-        <w:t>To select ICs, I have found a few reasonably priced options with multiple different interfaces and feature</w:t>
-      </w:r>
-      <w:r>
-        <w:rPr>
-          <w:lang w:val="en-GB"/>
-        </w:rPr>
-        <w:t xml:space="preserve"> </w:t>
-      </w:r>
-      <w:r>
-        <w:rPr>
-          <w:lang w:val="en-GB"/>
-        </w:rPr>
-        <w:t>sets to allow for a good variety of options</w:t>
-      </w:r>
-      <w:r>
-        <w:rPr>
-          <w:lang w:val="en-GB"/>
-        </w:rPr>
-        <w:t>.</w:t>
-      </w:r>
-    </w:p>
-    <w:p>
-      <w:pPr>
-        <w:rPr>
           <w:b/>
           <w:bCs/>
           <w:lang w:val="en-GB"/>
@@ -485,7 +514,249 @@
           <w:bCs/>
           <w:lang w:val="en-GB"/>
         </w:rPr>
-        <w:t>Background – MCU Selection</w:t>
+        <w:t>NAND</w:t>
+      </w:r>
+    </w:p>
+    <w:p>
+      <w:pPr>
+        <w:rPr>
+          <w:lang w:val="en-GB"/>
+        </w:rPr>
+      </w:pPr>
+      <w:hyperlink r:id="rId5" w:history="1">
+        <w:r>
+          <w:rPr>
+            <w:rStyle w:val="Hyperlink"/>
+            <w:lang w:val="en-GB"/>
+          </w:rPr>
+          <w:t>Parallel 1Gb NAND</w:t>
+        </w:r>
+      </w:hyperlink>
+    </w:p>
+    <w:p>
+      <w:pPr>
+        <w:rPr>
+          <w:lang w:val="en-GB"/>
+        </w:rPr>
+      </w:pPr>
+      <w:r>
+        <w:rPr>
+          <w:lang w:val="en-GB"/>
+        </w:rPr>
+        <w:t>Advantages:</w:t>
+      </w:r>
+    </w:p>
+    <w:p>
+      <w:pPr>
+        <w:pStyle w:val="ListParagraph"/>
+        <w:numPr>
+          <w:ilvl w:val="0"/>
+          <w:numId w:val="8"/>
+        </w:numPr>
+        <w:rPr>
+          <w:lang w:val="en-GB"/>
+        </w:rPr>
+      </w:pPr>
+      <w:r>
+        <w:rPr>
+          <w:lang w:val="en-GB"/>
+        </w:rPr>
+        <w:t xml:space="preserve">Similar low current draw to </w:t>
+      </w:r>
+      <w:proofErr w:type="gramStart"/>
+      <w:r>
+        <w:rPr>
+          <w:lang w:val="en-GB"/>
+        </w:rPr>
+        <w:t>other</w:t>
+      </w:r>
+      <w:proofErr w:type="gramEnd"/>
+      <w:r>
+        <w:rPr>
+          <w:lang w:val="en-GB"/>
+        </w:rPr>
+        <w:t xml:space="preserve"> NAND Package</w:t>
+      </w:r>
+    </w:p>
+    <w:p>
+      <w:pPr>
+        <w:rPr>
+          <w:lang w:val="en-GB"/>
+        </w:rPr>
+      </w:pPr>
+      <w:r>
+        <w:rPr>
+          <w:lang w:val="en-GB"/>
+        </w:rPr>
+        <w:t>Disadvantages:</w:t>
+      </w:r>
+    </w:p>
+    <w:p>
+      <w:pPr>
+        <w:pStyle w:val="ListParagraph"/>
+        <w:numPr>
+          <w:ilvl w:val="0"/>
+          <w:numId w:val="8"/>
+        </w:numPr>
+        <w:rPr>
+          <w:lang w:val="en-GB"/>
+        </w:rPr>
+      </w:pPr>
+      <w:r>
+        <w:rPr>
+          <w:lang w:val="en-GB"/>
+        </w:rPr>
+        <w:t>Hard to solder BGA package</w:t>
+      </w:r>
+    </w:p>
+    <w:p>
+      <w:pPr>
+        <w:pStyle w:val="ListParagraph"/>
+        <w:numPr>
+          <w:ilvl w:val="0"/>
+          <w:numId w:val="8"/>
+        </w:numPr>
+        <w:rPr>
+          <w:lang w:val="en-GB"/>
+        </w:rPr>
+      </w:pPr>
+      <w:r>
+        <w:rPr>
+          <w:lang w:val="en-GB"/>
+        </w:rPr>
+        <w:t>Needs more GPIOs</w:t>
+      </w:r>
+    </w:p>
+    <w:p>
+      <w:pPr>
+        <w:rPr>
+          <w:lang w:val="en-GB"/>
+        </w:rPr>
+      </w:pPr>
+      <w:hyperlink r:id="rId6" w:history="1">
+        <w:r>
+          <w:rPr>
+            <w:rStyle w:val="Hyperlink"/>
+            <w:lang w:val="en-GB"/>
+          </w:rPr>
+          <w:t>SPI 1Gb NAND</w:t>
+        </w:r>
+      </w:hyperlink>
+    </w:p>
+    <w:p>
+      <w:pPr>
+        <w:rPr>
+          <w:lang w:val="en-GB"/>
+        </w:rPr>
+      </w:pPr>
+      <w:r>
+        <w:rPr>
+          <w:lang w:val="en-GB"/>
+        </w:rPr>
+        <w:t>Advantages:</w:t>
+      </w:r>
+    </w:p>
+    <w:p>
+      <w:pPr>
+        <w:pStyle w:val="ListParagraph"/>
+        <w:numPr>
+          <w:ilvl w:val="0"/>
+          <w:numId w:val="6"/>
+        </w:numPr>
+        <w:rPr>
+          <w:lang w:val="en-GB"/>
+        </w:rPr>
+      </w:pPr>
+      <w:r>
+        <w:rPr>
+          <w:lang w:val="en-GB"/>
+        </w:rPr>
+        <w:t>Simplest overall package for easier layout</w:t>
+      </w:r>
+    </w:p>
+    <w:p>
+      <w:pPr>
+        <w:pStyle w:val="ListParagraph"/>
+        <w:numPr>
+          <w:ilvl w:val="0"/>
+          <w:numId w:val="6"/>
+        </w:numPr>
+        <w:rPr>
+          <w:lang w:val="en-GB"/>
+        </w:rPr>
+      </w:pPr>
+      <w:r>
+        <w:rPr>
+          <w:lang w:val="en-GB"/>
+        </w:rPr>
+        <w:t>Low current draw at 30mA</w:t>
+      </w:r>
+    </w:p>
+    <w:p>
+      <w:pPr>
+        <w:pStyle w:val="ListParagraph"/>
+        <w:numPr>
+          <w:ilvl w:val="0"/>
+          <w:numId w:val="6"/>
+        </w:numPr>
+        <w:rPr>
+          <w:lang w:val="en-GB"/>
+        </w:rPr>
+      </w:pPr>
+      <w:r>
+        <w:rPr>
+          <w:lang w:val="en-GB"/>
+        </w:rPr>
+        <w:t>Lower cost</w:t>
+      </w:r>
+    </w:p>
+    <w:p>
+      <w:pPr>
+        <w:rPr>
+          <w:lang w:val="en-GB"/>
+        </w:rPr>
+      </w:pPr>
+      <w:r>
+        <w:rPr>
+          <w:lang w:val="en-GB"/>
+        </w:rPr>
+        <w:t>Disadvantages:</w:t>
+      </w:r>
+    </w:p>
+    <w:p>
+      <w:pPr>
+        <w:pStyle w:val="ListParagraph"/>
+        <w:numPr>
+          <w:ilvl w:val="0"/>
+          <w:numId w:val="7"/>
+        </w:numPr>
+        <w:rPr>
+          <w:lang w:val="en-GB"/>
+        </w:rPr>
+      </w:pPr>
+      <w:r>
+        <w:rPr>
+          <w:lang w:val="en-GB"/>
+        </w:rPr>
+        <w:t>Less endurance than NOR options</w:t>
+      </w:r>
+    </w:p>
+    <w:p>
+      <w:pPr>
+        <w:pStyle w:val="ListParagraph"/>
+        <w:numPr>
+          <w:ilvl w:val="0"/>
+          <w:numId w:val="7"/>
+        </w:numPr>
+        <w:rPr>
+          <w:lang w:val="en-GB"/>
+        </w:rPr>
+      </w:pPr>
+      <w:r>
+        <w:rPr>
+          <w:lang w:val="en-GB"/>
+        </w:rPr>
+        <w:t>Higher standby current draw</w:t>
       </w:r>
     </w:p>
     <w:p>
@@ -496,21 +767,514 @@
           <w:lang w:val="en-GB"/>
         </w:rPr>
       </w:pPr>
-    </w:p>
-    <w:p>
-      <w:pPr>
+      <w:r>
         <w:rPr>
           <w:b/>
           <w:bCs/>
           <w:lang w:val="en-GB"/>
         </w:rPr>
-      </w:pPr>
-      <w:r>
+        <w:t>NOR</w:t>
+      </w:r>
+    </w:p>
+    <w:p>
+      <w:pPr>
+        <w:rPr>
+          <w:lang w:val="en-GB"/>
+        </w:rPr>
+      </w:pPr>
+      <w:hyperlink r:id="rId7" w:history="1">
+        <w:r>
+          <w:rPr>
+            <w:rStyle w:val="Hyperlink"/>
+            <w:lang w:val="en-GB"/>
+          </w:rPr>
+          <w:t>Parallel 512Mb NOR</w:t>
+        </w:r>
+      </w:hyperlink>
+    </w:p>
+    <w:p>
+      <w:pPr>
+        <w:rPr>
+          <w:lang w:val="en-GB"/>
+        </w:rPr>
+      </w:pPr>
+      <w:r>
+        <w:rPr>
+          <w:lang w:val="en-GB"/>
+        </w:rPr>
+        <w:t>Advantages:</w:t>
+      </w:r>
+    </w:p>
+    <w:p>
+      <w:pPr>
+        <w:pStyle w:val="ListParagraph"/>
+        <w:numPr>
+          <w:ilvl w:val="0"/>
+          <w:numId w:val="3"/>
+        </w:numPr>
+        <w:rPr>
+          <w:lang w:val="en-GB"/>
+        </w:rPr>
+      </w:pPr>
+      <w:r>
+        <w:rPr>
+          <w:lang w:val="en-GB"/>
+        </w:rPr>
+        <w:t xml:space="preserve">Higher </w:t>
+      </w:r>
+      <w:proofErr w:type="gramStart"/>
+      <w:r>
+        <w:rPr>
+          <w:lang w:val="en-GB"/>
+        </w:rPr>
+        <w:t>16 bit</w:t>
+      </w:r>
+      <w:proofErr w:type="gramEnd"/>
+      <w:r>
+        <w:rPr>
+          <w:lang w:val="en-GB"/>
+        </w:rPr>
+        <w:t xml:space="preserve"> bus width</w:t>
+      </w:r>
+    </w:p>
+    <w:p>
+      <w:pPr>
+        <w:pStyle w:val="ListParagraph"/>
+        <w:numPr>
+          <w:ilvl w:val="0"/>
+          <w:numId w:val="3"/>
+        </w:numPr>
+        <w:rPr>
+          <w:lang w:val="en-GB"/>
+        </w:rPr>
+      </w:pPr>
+      <w:r>
+        <w:rPr>
+          <w:lang w:val="en-GB"/>
+        </w:rPr>
+        <w:t>Lower 60mA active read current</w:t>
+      </w:r>
+    </w:p>
+    <w:p>
+      <w:pPr>
+        <w:rPr>
+          <w:lang w:val="en-GB"/>
+        </w:rPr>
+      </w:pPr>
+      <w:r>
+        <w:rPr>
+          <w:lang w:val="en-GB"/>
+        </w:rPr>
+        <w:t>Disadvantages:</w:t>
+      </w:r>
+    </w:p>
+    <w:p>
+      <w:pPr>
+        <w:pStyle w:val="ListParagraph"/>
+        <w:numPr>
+          <w:ilvl w:val="0"/>
+          <w:numId w:val="3"/>
+        </w:numPr>
+        <w:rPr>
+          <w:lang w:val="en-GB"/>
+        </w:rPr>
+      </w:pPr>
+      <w:r>
+        <w:rPr>
+          <w:lang w:val="en-GB"/>
+        </w:rPr>
+        <w:t>Many GPIOs needed to control</w:t>
+      </w:r>
+    </w:p>
+    <w:p>
+      <w:pPr>
+        <w:pStyle w:val="ListParagraph"/>
+        <w:numPr>
+          <w:ilvl w:val="0"/>
+          <w:numId w:val="3"/>
+        </w:numPr>
+        <w:rPr>
+          <w:lang w:val="en-GB"/>
+        </w:rPr>
+      </w:pPr>
+      <w:r>
+        <w:rPr>
+          <w:lang w:val="en-GB"/>
+        </w:rPr>
+        <w:t>Costs more than similar SPI equivalent</w:t>
+      </w:r>
+    </w:p>
+    <w:p>
+      <w:pPr>
+        <w:rPr>
+          <w:lang w:val="en-GB"/>
+        </w:rPr>
+      </w:pPr>
+      <w:hyperlink r:id="rId8" w:history="1">
+        <w:r>
+          <w:rPr>
+            <w:rStyle w:val="Hyperlink"/>
+            <w:lang w:val="en-GB"/>
+          </w:rPr>
+          <w:t>SPI 512Mb NOR</w:t>
+        </w:r>
+      </w:hyperlink>
+    </w:p>
+    <w:p>
+      <w:pPr>
+        <w:rPr>
+          <w:lang w:val="en-GB"/>
+        </w:rPr>
+      </w:pPr>
+      <w:r>
+        <w:rPr>
+          <w:lang w:val="en-GB"/>
+        </w:rPr>
+        <w:t>Advantages:</w:t>
+      </w:r>
+    </w:p>
+    <w:p>
+      <w:pPr>
+        <w:pStyle w:val="ListParagraph"/>
+        <w:numPr>
+          <w:ilvl w:val="0"/>
+          <w:numId w:val="4"/>
+        </w:numPr>
+        <w:rPr>
+          <w:lang w:val="en-GB"/>
+        </w:rPr>
+      </w:pPr>
+      <w:r>
+        <w:rPr>
+          <w:lang w:val="en-GB"/>
+        </w:rPr>
+        <w:lastRenderedPageBreak/>
+        <w:t>Lower cost than parallel option</w:t>
+      </w:r>
+    </w:p>
+    <w:p>
+      <w:pPr>
+        <w:pStyle w:val="ListParagraph"/>
+        <w:numPr>
+          <w:ilvl w:val="0"/>
+          <w:numId w:val="4"/>
+        </w:numPr>
+        <w:rPr>
+          <w:lang w:val="en-GB"/>
+        </w:rPr>
+      </w:pPr>
+      <w:r>
+        <w:rPr>
+          <w:lang w:val="en-GB"/>
+        </w:rPr>
+        <w:t>Small footprint and simpler PCB layout</w:t>
+      </w:r>
+    </w:p>
+    <w:p>
+      <w:pPr>
+        <w:rPr>
+          <w:lang w:val="en-GB"/>
+        </w:rPr>
+      </w:pPr>
+      <w:r>
+        <w:rPr>
+          <w:lang w:val="en-GB"/>
+        </w:rPr>
+        <w:t>Disadvantages:</w:t>
+      </w:r>
+    </w:p>
+    <w:p>
+      <w:pPr>
+        <w:pStyle w:val="ListParagraph"/>
+        <w:numPr>
+          <w:ilvl w:val="0"/>
+          <w:numId w:val="5"/>
+        </w:numPr>
+        <w:rPr>
+          <w:lang w:val="en-GB"/>
+        </w:rPr>
+      </w:pPr>
+      <w:r>
+        <w:rPr>
+          <w:lang w:val="en-GB"/>
+        </w:rPr>
+        <w:t>Smaller bus width</w:t>
+      </w:r>
+    </w:p>
+    <w:p>
+      <w:pPr>
+        <w:pStyle w:val="ListParagraph"/>
+        <w:numPr>
+          <w:ilvl w:val="0"/>
+          <w:numId w:val="5"/>
+        </w:numPr>
+        <w:rPr>
+          <w:lang w:val="en-GB"/>
+        </w:rPr>
+      </w:pPr>
+      <w:r>
+        <w:rPr>
+          <w:lang w:val="en-GB"/>
+        </w:rPr>
+        <w:t>Higher 90mA active read current</w:t>
+      </w:r>
+    </w:p>
+    <w:p>
+      <w:pPr>
         <w:rPr>
           <w:b/>
           <w:bCs/>
           <w:lang w:val="en-GB"/>
         </w:rPr>
+      </w:pPr>
+      <w:r>
+        <w:rPr>
+          <w:b/>
+          <w:bCs/>
+          <w:lang w:val="en-GB"/>
+        </w:rPr>
+        <w:t>Overall Selection</w:t>
+      </w:r>
+    </w:p>
+    <w:p>
+      <w:pPr>
+        <w:rPr>
+          <w:lang w:val="en-GB"/>
+        </w:rPr>
+      </w:pPr>
+      <w:r>
+        <w:rPr>
+          <w:lang w:val="en-GB"/>
+        </w:rPr>
+        <w:t>SPI has been chosen as it avoids significant GPIO wastage and is easier to program, the decision between NAND and NOR is simply based on the required endurance, cost, and capacity, given our low capacity requirements and a generally low cost across the board, and the low power consumption environment it will be running in, I have chosen to use an SPI NOR package with a capacity of 512Mb.</w:t>
+      </w:r>
+    </w:p>
+    <w:p>
+      <w:pPr>
+        <w:rPr>
+          <w:lang w:val="en-GB"/>
+        </w:rPr>
+      </w:pPr>
+      <w:r>
+        <w:rPr>
+          <w:lang w:val="en-GB"/>
+        </w:rPr>
+        <w:t xml:space="preserve">The chosen package is the </w:t>
+      </w:r>
+      <w:hyperlink r:id="rId9" w:history="1">
+        <w:r>
+          <w:rPr>
+            <w:rStyle w:val="Hyperlink"/>
+            <w:lang w:val="en-GB"/>
+          </w:rPr>
+          <w:t>Infineon S25HL512TDPNHI010</w:t>
+        </w:r>
+      </w:hyperlink>
+      <w:r>
+        <w:rPr>
+          <w:lang w:val="en-GB"/>
+        </w:rPr>
+        <w:t xml:space="preserve"> due to it’s combination of compact package, easy PCB routing, decent active power draw at 40mA and low cost in comparison to other options.</w:t>
+      </w:r>
+    </w:p>
+    <w:p>
+      <w:pPr>
+        <w:rPr>
+          <w:b/>
+          <w:bCs/>
+          <w:lang w:val="en-GB"/>
+        </w:rPr>
+      </w:pPr>
+      <w:r>
+        <w:rPr>
+          <w:b/>
+          <w:bCs/>
+          <w:lang w:val="en-GB"/>
+        </w:rPr>
+        <w:t>Background – MCU Selection</w:t>
+      </w:r>
+    </w:p>
+    <w:p>
+      <w:pPr>
+        <w:rPr>
+          <w:lang w:val="en-GB"/>
+        </w:rPr>
+      </w:pPr>
+      <w:r>
+        <w:rPr>
+          <w:lang w:val="en-GB"/>
+        </w:rPr>
+        <w:t xml:space="preserve">To choose an MCU, I had a few main criteria – </w:t>
+      </w:r>
+    </w:p>
+    <w:p>
+      <w:pPr>
+        <w:pStyle w:val="ListParagraph"/>
+        <w:numPr>
+          <w:ilvl w:val="0"/>
+          <w:numId w:val="9"/>
+        </w:numPr>
+        <w:rPr>
+          <w:lang w:val="en-GB"/>
+        </w:rPr>
+      </w:pPr>
+      <w:r>
+        <w:rPr>
+          <w:lang w:val="en-GB"/>
+        </w:rPr>
+        <w:t>Low idle power consumption</w:t>
+      </w:r>
+    </w:p>
+    <w:p>
+      <w:pPr>
+        <w:pStyle w:val="ListParagraph"/>
+        <w:numPr>
+          <w:ilvl w:val="0"/>
+          <w:numId w:val="9"/>
+        </w:numPr>
+        <w:rPr>
+          <w:lang w:val="en-GB"/>
+        </w:rPr>
+      </w:pPr>
+      <w:r>
+        <w:rPr>
+          <w:lang w:val="en-GB"/>
+        </w:rPr>
+        <w:t>Easy PCB integration (minimal external components needed)</w:t>
+      </w:r>
+    </w:p>
+    <w:p>
+      <w:pPr>
+        <w:pStyle w:val="ListParagraph"/>
+        <w:numPr>
+          <w:ilvl w:val="0"/>
+          <w:numId w:val="9"/>
+        </w:numPr>
+        <w:rPr>
+          <w:lang w:val="en-GB"/>
+        </w:rPr>
+      </w:pPr>
+      <w:r>
+        <w:rPr>
+          <w:lang w:val="en-GB"/>
+        </w:rPr>
+        <w:t xml:space="preserve">Easy programming with both </w:t>
+      </w:r>
+      <w:proofErr w:type="spellStart"/>
+      <w:r>
+        <w:rPr>
+          <w:lang w:val="en-GB"/>
+        </w:rPr>
+        <w:t>MicroPython</w:t>
+      </w:r>
+      <w:proofErr w:type="spellEnd"/>
+      <w:r>
+        <w:rPr>
+          <w:lang w:val="en-GB"/>
+        </w:rPr>
+        <w:t xml:space="preserve"> and C++ options available.</w:t>
+      </w:r>
+    </w:p>
+    <w:p>
+      <w:pPr>
+        <w:pStyle w:val="ListParagraph"/>
+        <w:numPr>
+          <w:ilvl w:val="0"/>
+          <w:numId w:val="9"/>
+        </w:numPr>
+        <w:rPr>
+          <w:lang w:val="en-GB"/>
+        </w:rPr>
+      </w:pPr>
+      <w:r>
+        <w:rPr>
+          <w:lang w:val="en-GB"/>
+        </w:rPr>
+        <w:t>Good documentation and datasheet.</w:t>
+      </w:r>
+    </w:p>
+    <w:p>
+      <w:pPr>
+        <w:rPr>
+          <w:lang w:val="en-GB"/>
+        </w:rPr>
+      </w:pPr>
+      <w:r>
+        <w:rPr>
+          <w:lang w:val="en-GB"/>
+        </w:rPr>
+        <w:t>From these criteria I have looked at a few different families</w:t>
+      </w:r>
+      <w:r>
+        <w:rPr>
+          <w:lang w:val="en-GB"/>
+        </w:rPr>
+        <w:t xml:space="preserve"> of microcontrollers including the ESP32, RP2040 and 2350, and the STM32</w:t>
+      </w:r>
+      <w:r>
+        <w:rPr>
+          <w:lang w:val="en-GB"/>
+        </w:rPr>
+        <w:t xml:space="preserve">, when looking into these different microcontrollers, the ESP32-WROOM modules stood out due to their easy to use design, having a variety of needed parts built in such as USB to serial conversion and flash memory for the program being run, this however made them more expensive than alternative options, the RP family from raspberry pi stood out for its fantastic documentation including minimal reference designs and PCB layout examples. </w:t>
+      </w:r>
+      <w:proofErr w:type="gramStart"/>
+      <w:r>
+        <w:rPr>
+          <w:lang w:val="en-GB"/>
+        </w:rPr>
+        <w:t>Finally</w:t>
+      </w:r>
+      <w:proofErr w:type="gramEnd"/>
+      <w:r>
+        <w:rPr>
+          <w:lang w:val="en-GB"/>
+        </w:rPr>
+        <w:t xml:space="preserve"> the STM32 family from STMicroelectronics was desirable due to its heavy use in industry and variety of options to choose from. In the end to simplify the design overall I chose to use an </w:t>
+      </w:r>
+      <w:hyperlink r:id="rId10" w:history="1">
+        <w:r>
+          <w:rPr>
+            <w:rStyle w:val="Hyperlink"/>
+            <w:lang w:val="en-GB"/>
+          </w:rPr>
+          <w:t>ESP32-S3-WROOM-1U</w:t>
+        </w:r>
+      </w:hyperlink>
+      <w:r>
+        <w:rPr>
+          <w:lang w:val="en-GB"/>
+        </w:rPr>
+        <w:t xml:space="preserve"> due to </w:t>
+      </w:r>
+      <w:proofErr w:type="spellStart"/>
+      <w:r>
+        <w:rPr>
+          <w:lang w:val="en-GB"/>
+        </w:rPr>
+        <w:t>it’s</w:t>
+      </w:r>
+      <w:proofErr w:type="spellEnd"/>
+      <w:r>
+        <w:rPr>
+          <w:lang w:val="en-GB"/>
+        </w:rPr>
+        <w:t xml:space="preserve"> built in USB to serial converter, flash memory and easy to route footprint.</w:t>
+      </w:r>
+    </w:p>
+    <w:p>
+      <w:pPr>
+        <w:rPr>
+          <w:b/>
+          <w:bCs/>
+          <w:lang w:val="en-GB"/>
+        </w:rPr>
+      </w:pPr>
+      <w:r>
+        <w:rPr>
+          <w:b/>
+          <w:bCs/>
+          <w:lang w:val="en-GB"/>
+        </w:rPr>
         <w:t>References</w:t>
       </w:r>
     </w:p>
@@ -531,6 +1295,7 @@
     </w:p>
     <w:p>
       <w:r>
+        <w:lastRenderedPageBreak/>
         <w:t xml:space="preserve">Chang, C. (n.d.). </w:t>
       </w:r>
       <w:r>
@@ -595,6 +1360,119 @@
 <file path=word/numbering.xml><?xml version="1.0" encoding="utf-8"?>
 <w:numbering xmlns:wpc="http://schemas.microsoft.com/office/word/2010/wordprocessingCanvas" xmlns:cx="http://schemas.microsoft.com/office/drawing/2014/chartex" xmlns:cx1="http://schemas.microsoft.com/office/drawing/2015/9/8/chartex" xmlns:cx2="http://schemas.microsoft.com/office/drawing/2015/10/21/chartex" xmlns:cx3="http://schemas.microsoft.com/office/drawing/2016/5/9/chartex" xmlns:cx4="http://schemas.microsoft.com/office/drawing/2016/5/10/chartex" xmlns:cx5="http://schemas.microsoft.com/office/drawing/2016/5/11/chartex" xmlns:cx6="http://schemas.microsoft.com/office/drawing/2016/5/12/chartex" xmlns:cx7="http://schemas.microsoft.com/office/drawing/2016/5/13/chartex" xmlns:cx8="http://schemas.microsoft.com/office/drawing/2016/5/14/chartex" xmlns:mc="http://schemas.openxmlformats.org/markup-compatibility/2006" xmlns:aink="http://schemas.microsoft.com/office/drawing/2016/ink" xmlns:am3d="http://schemas.microsoft.com/office/drawing/2017/model3d" xmlns:o="urn:schemas-microsoft-com:office:office" xmlns:oel="http://schemas.microsoft.com/office/2019/extlst" xmlns:r="http://schemas.openxmlformats.org/officeDocument/2006/relationships" xmlns:m="http://schemas.openxmlformats.org/officeDocument/2006/math" xmlns:v="urn:schemas-microsoft-com:vml" xmlns:wp14="http://schemas.microsoft.com/office/word/2010/wordprocessingDrawing" xmlns:wp="http://schemas.openxmlformats.org/drawingml/2006/wordprocessingDrawing" xmlns:w10="urn:schemas-microsoft-com:office:word" xmlns:w="http://schemas.openxmlformats.org/wordprocessingml/2006/main" xmlns:w14="http://schemas.microsoft.com/office/word/2010/wordml" xmlns:w15="http://schemas.microsoft.com/office/word/2012/wordml" xmlns:w16cex="http://schemas.microsoft.com/office/word/2018/wordml/cex" xmlns:w16cid="http://schemas.microsoft.com/office/word/2016/wordml/cid" xmlns:w16="http://schemas.microsoft.com/office/word/2018/wordml" xmlns:w16du="http://schemas.microsoft.com/office/word/2023/wordml/word16du" xmlns:w16sdtdh="http://schemas.microsoft.com/office/word/2020/wordml/sdtdatahash" xmlns:w16sdtfl="http://schemas.microsoft.com/office/word/2024/wordml/sdtformatlock" xmlns:w16se="http://schemas.microsoft.com/office/word/2015/wordml/symex" xmlns:wpg="http://schemas.microsoft.com/office/word/2010/wordprocessingGroup" xmlns:wpi="http://schemas.microsoft.com/office/word/2010/wordprocessingInk" xmlns:wne="http://schemas.microsoft.com/office/word/2006/wordml" xmlns:wps="http://schemas.microsoft.com/office/word/2010/wordprocessingShape" mc:Ignorable="w14 w15 w16se w16cid w16 w16cex w16sdtdh w16sdtfl w16du wp14">
   <w:abstractNum w:abstractNumId="0" w15:restartNumberingAfterBreak="0">
+    <w:nsid w:val="06051A6D"/>
+    <w:multiLevelType w:val="hybridMultilevel"/>
+    <w:tmpl w:val="082CDD2A"/>
+    <w:lvl w:ilvl="0" w:tplc="0C090001">
+      <w:start w:val="1"/>
+      <w:numFmt w:val="bullet"/>
+      <w:lvlText w:val=""/>
+      <w:lvlJc w:val="left"/>
+      <w:pPr>
+        <w:ind w:left="720" w:hanging="360"/>
+      </w:pPr>
+      <w:rPr>
+        <w:rFonts w:ascii="Symbol" w:hAnsi="Symbol" w:hint="default"/>
+      </w:rPr>
+    </w:lvl>
+    <w:lvl w:ilvl="1" w:tplc="0C090003" w:tentative="1">
+      <w:start w:val="1"/>
+      <w:numFmt w:val="bullet"/>
+      <w:lvlText w:val="o"/>
+      <w:lvlJc w:val="left"/>
+      <w:pPr>
+        <w:ind w:left="1440" w:hanging="360"/>
+      </w:pPr>
+      <w:rPr>
+        <w:rFonts w:ascii="Courier New" w:hAnsi="Courier New" w:cs="Courier New" w:hint="default"/>
+      </w:rPr>
+    </w:lvl>
+    <w:lvl w:ilvl="2" w:tplc="0C090005" w:tentative="1">
+      <w:start w:val="1"/>
+      <w:numFmt w:val="bullet"/>
+      <w:lvlText w:val=""/>
+      <w:lvlJc w:val="left"/>
+      <w:pPr>
+        <w:ind w:left="2160" w:hanging="360"/>
+      </w:pPr>
+      <w:rPr>
+        <w:rFonts w:ascii="Wingdings" w:hAnsi="Wingdings" w:hint="default"/>
+      </w:rPr>
+    </w:lvl>
+    <w:lvl w:ilvl="3" w:tplc="0C090001" w:tentative="1">
+      <w:start w:val="1"/>
+      <w:numFmt w:val="bullet"/>
+      <w:lvlText w:val=""/>
+      <w:lvlJc w:val="left"/>
+      <w:pPr>
+        <w:ind w:left="2880" w:hanging="360"/>
+      </w:pPr>
+      <w:rPr>
+        <w:rFonts w:ascii="Symbol" w:hAnsi="Symbol" w:hint="default"/>
+      </w:rPr>
+    </w:lvl>
+    <w:lvl w:ilvl="4" w:tplc="0C090003" w:tentative="1">
+      <w:start w:val="1"/>
+      <w:numFmt w:val="bullet"/>
+      <w:lvlText w:val="o"/>
+      <w:lvlJc w:val="left"/>
+      <w:pPr>
+        <w:ind w:left="3600" w:hanging="360"/>
+      </w:pPr>
+      <w:rPr>
+        <w:rFonts w:ascii="Courier New" w:hAnsi="Courier New" w:cs="Courier New" w:hint="default"/>
+      </w:rPr>
+    </w:lvl>
+    <w:lvl w:ilvl="5" w:tplc="0C090005" w:tentative="1">
+      <w:start w:val="1"/>
+      <w:numFmt w:val="bullet"/>
+      <w:lvlText w:val=""/>
+      <w:lvlJc w:val="left"/>
+      <w:pPr>
+        <w:ind w:left="4320" w:hanging="360"/>
+      </w:pPr>
+      <w:rPr>
+        <w:rFonts w:ascii="Wingdings" w:hAnsi="Wingdings" w:hint="default"/>
+      </w:rPr>
+    </w:lvl>
+    <w:lvl w:ilvl="6" w:tplc="0C090001" w:tentative="1">
+      <w:start w:val="1"/>
+      <w:numFmt w:val="bullet"/>
+      <w:lvlText w:val=""/>
+      <w:lvlJc w:val="left"/>
+      <w:pPr>
+        <w:ind w:left="5040" w:hanging="360"/>
+      </w:pPr>
+      <w:rPr>
+        <w:rFonts w:ascii="Symbol" w:hAnsi="Symbol" w:hint="default"/>
+      </w:rPr>
+    </w:lvl>
+    <w:lvl w:ilvl="7" w:tplc="0C090003" w:tentative="1">
+      <w:start w:val="1"/>
+      <w:numFmt w:val="bullet"/>
+      <w:lvlText w:val="o"/>
+      <w:lvlJc w:val="left"/>
+      <w:pPr>
+        <w:ind w:left="5760" w:hanging="360"/>
+      </w:pPr>
+      <w:rPr>
+        <w:rFonts w:ascii="Courier New" w:hAnsi="Courier New" w:cs="Courier New" w:hint="default"/>
+      </w:rPr>
+    </w:lvl>
+    <w:lvl w:ilvl="8" w:tplc="0C090005" w:tentative="1">
+      <w:start w:val="1"/>
+      <w:numFmt w:val="bullet"/>
+      <w:lvlText w:val=""/>
+      <w:lvlJc w:val="left"/>
+      <w:pPr>
+        <w:ind w:left="6480" w:hanging="360"/>
+      </w:pPr>
+      <w:rPr>
+        <w:rFonts w:ascii="Wingdings" w:hAnsi="Wingdings" w:hint="default"/>
+      </w:rPr>
+    </w:lvl>
+  </w:abstractNum>
+  <w:abstractNum w:abstractNumId="1" w15:restartNumberingAfterBreak="0">
     <w:nsid w:val="07C3684B"/>
     <w:multiLevelType w:val="hybridMultilevel"/>
     <w:tmpl w:val="965234A2"/>
@@ -707,7 +1585,459 @@
       </w:rPr>
     </w:lvl>
   </w:abstractNum>
-  <w:abstractNum w:abstractNumId="1" w15:restartNumberingAfterBreak="0">
+  <w:abstractNum w:abstractNumId="2" w15:restartNumberingAfterBreak="0">
+    <w:nsid w:val="0DBD4416"/>
+    <w:multiLevelType w:val="hybridMultilevel"/>
+    <w:tmpl w:val="647A1270"/>
+    <w:lvl w:ilvl="0" w:tplc="0C090001">
+      <w:start w:val="1"/>
+      <w:numFmt w:val="bullet"/>
+      <w:lvlText w:val=""/>
+      <w:lvlJc w:val="left"/>
+      <w:pPr>
+        <w:ind w:left="720" w:hanging="360"/>
+      </w:pPr>
+      <w:rPr>
+        <w:rFonts w:ascii="Symbol" w:hAnsi="Symbol" w:hint="default"/>
+      </w:rPr>
+    </w:lvl>
+    <w:lvl w:ilvl="1" w:tplc="0C090003" w:tentative="1">
+      <w:start w:val="1"/>
+      <w:numFmt w:val="bullet"/>
+      <w:lvlText w:val="o"/>
+      <w:lvlJc w:val="left"/>
+      <w:pPr>
+        <w:ind w:left="1440" w:hanging="360"/>
+      </w:pPr>
+      <w:rPr>
+        <w:rFonts w:ascii="Courier New" w:hAnsi="Courier New" w:cs="Courier New" w:hint="default"/>
+      </w:rPr>
+    </w:lvl>
+    <w:lvl w:ilvl="2" w:tplc="0C090005" w:tentative="1">
+      <w:start w:val="1"/>
+      <w:numFmt w:val="bullet"/>
+      <w:lvlText w:val=""/>
+      <w:lvlJc w:val="left"/>
+      <w:pPr>
+        <w:ind w:left="2160" w:hanging="360"/>
+      </w:pPr>
+      <w:rPr>
+        <w:rFonts w:ascii="Wingdings" w:hAnsi="Wingdings" w:hint="default"/>
+      </w:rPr>
+    </w:lvl>
+    <w:lvl w:ilvl="3" w:tplc="0C090001" w:tentative="1">
+      <w:start w:val="1"/>
+      <w:numFmt w:val="bullet"/>
+      <w:lvlText w:val=""/>
+      <w:lvlJc w:val="left"/>
+      <w:pPr>
+        <w:ind w:left="2880" w:hanging="360"/>
+      </w:pPr>
+      <w:rPr>
+        <w:rFonts w:ascii="Symbol" w:hAnsi="Symbol" w:hint="default"/>
+      </w:rPr>
+    </w:lvl>
+    <w:lvl w:ilvl="4" w:tplc="0C090003" w:tentative="1">
+      <w:start w:val="1"/>
+      <w:numFmt w:val="bullet"/>
+      <w:lvlText w:val="o"/>
+      <w:lvlJc w:val="left"/>
+      <w:pPr>
+        <w:ind w:left="3600" w:hanging="360"/>
+      </w:pPr>
+      <w:rPr>
+        <w:rFonts w:ascii="Courier New" w:hAnsi="Courier New" w:cs="Courier New" w:hint="default"/>
+      </w:rPr>
+    </w:lvl>
+    <w:lvl w:ilvl="5" w:tplc="0C090005" w:tentative="1">
+      <w:start w:val="1"/>
+      <w:numFmt w:val="bullet"/>
+      <w:lvlText w:val=""/>
+      <w:lvlJc w:val="left"/>
+      <w:pPr>
+        <w:ind w:left="4320" w:hanging="360"/>
+      </w:pPr>
+      <w:rPr>
+        <w:rFonts w:ascii="Wingdings" w:hAnsi="Wingdings" w:hint="default"/>
+      </w:rPr>
+    </w:lvl>
+    <w:lvl w:ilvl="6" w:tplc="0C090001" w:tentative="1">
+      <w:start w:val="1"/>
+      <w:numFmt w:val="bullet"/>
+      <w:lvlText w:val=""/>
+      <w:lvlJc w:val="left"/>
+      <w:pPr>
+        <w:ind w:left="5040" w:hanging="360"/>
+      </w:pPr>
+      <w:rPr>
+        <w:rFonts w:ascii="Symbol" w:hAnsi="Symbol" w:hint="default"/>
+      </w:rPr>
+    </w:lvl>
+    <w:lvl w:ilvl="7" w:tplc="0C090003" w:tentative="1">
+      <w:start w:val="1"/>
+      <w:numFmt w:val="bullet"/>
+      <w:lvlText w:val="o"/>
+      <w:lvlJc w:val="left"/>
+      <w:pPr>
+        <w:ind w:left="5760" w:hanging="360"/>
+      </w:pPr>
+      <w:rPr>
+        <w:rFonts w:ascii="Courier New" w:hAnsi="Courier New" w:cs="Courier New" w:hint="default"/>
+      </w:rPr>
+    </w:lvl>
+    <w:lvl w:ilvl="8" w:tplc="0C090005" w:tentative="1">
+      <w:start w:val="1"/>
+      <w:numFmt w:val="bullet"/>
+      <w:lvlText w:val=""/>
+      <w:lvlJc w:val="left"/>
+      <w:pPr>
+        <w:ind w:left="6480" w:hanging="360"/>
+      </w:pPr>
+      <w:rPr>
+        <w:rFonts w:ascii="Wingdings" w:hAnsi="Wingdings" w:hint="default"/>
+      </w:rPr>
+    </w:lvl>
+  </w:abstractNum>
+  <w:abstractNum w:abstractNumId="3" w15:restartNumberingAfterBreak="0">
+    <w:nsid w:val="307B0F4C"/>
+    <w:multiLevelType w:val="hybridMultilevel"/>
+    <w:tmpl w:val="3198028C"/>
+    <w:lvl w:ilvl="0" w:tplc="0C090001">
+      <w:start w:val="1"/>
+      <w:numFmt w:val="bullet"/>
+      <w:lvlText w:val=""/>
+      <w:lvlJc w:val="left"/>
+      <w:pPr>
+        <w:ind w:left="720" w:hanging="360"/>
+      </w:pPr>
+      <w:rPr>
+        <w:rFonts w:ascii="Symbol" w:hAnsi="Symbol" w:hint="default"/>
+      </w:rPr>
+    </w:lvl>
+    <w:lvl w:ilvl="1" w:tplc="0C090003" w:tentative="1">
+      <w:start w:val="1"/>
+      <w:numFmt w:val="bullet"/>
+      <w:lvlText w:val="o"/>
+      <w:lvlJc w:val="left"/>
+      <w:pPr>
+        <w:ind w:left="1440" w:hanging="360"/>
+      </w:pPr>
+      <w:rPr>
+        <w:rFonts w:ascii="Courier New" w:hAnsi="Courier New" w:cs="Courier New" w:hint="default"/>
+      </w:rPr>
+    </w:lvl>
+    <w:lvl w:ilvl="2" w:tplc="0C090005" w:tentative="1">
+      <w:start w:val="1"/>
+      <w:numFmt w:val="bullet"/>
+      <w:lvlText w:val=""/>
+      <w:lvlJc w:val="left"/>
+      <w:pPr>
+        <w:ind w:left="2160" w:hanging="360"/>
+      </w:pPr>
+      <w:rPr>
+        <w:rFonts w:ascii="Wingdings" w:hAnsi="Wingdings" w:hint="default"/>
+      </w:rPr>
+    </w:lvl>
+    <w:lvl w:ilvl="3" w:tplc="0C090001" w:tentative="1">
+      <w:start w:val="1"/>
+      <w:numFmt w:val="bullet"/>
+      <w:lvlText w:val=""/>
+      <w:lvlJc w:val="left"/>
+      <w:pPr>
+        <w:ind w:left="2880" w:hanging="360"/>
+      </w:pPr>
+      <w:rPr>
+        <w:rFonts w:ascii="Symbol" w:hAnsi="Symbol" w:hint="default"/>
+      </w:rPr>
+    </w:lvl>
+    <w:lvl w:ilvl="4" w:tplc="0C090003" w:tentative="1">
+      <w:start w:val="1"/>
+      <w:numFmt w:val="bullet"/>
+      <w:lvlText w:val="o"/>
+      <w:lvlJc w:val="left"/>
+      <w:pPr>
+        <w:ind w:left="3600" w:hanging="360"/>
+      </w:pPr>
+      <w:rPr>
+        <w:rFonts w:ascii="Courier New" w:hAnsi="Courier New" w:cs="Courier New" w:hint="default"/>
+      </w:rPr>
+    </w:lvl>
+    <w:lvl w:ilvl="5" w:tplc="0C090005" w:tentative="1">
+      <w:start w:val="1"/>
+      <w:numFmt w:val="bullet"/>
+      <w:lvlText w:val=""/>
+      <w:lvlJc w:val="left"/>
+      <w:pPr>
+        <w:ind w:left="4320" w:hanging="360"/>
+      </w:pPr>
+      <w:rPr>
+        <w:rFonts w:ascii="Wingdings" w:hAnsi="Wingdings" w:hint="default"/>
+      </w:rPr>
+    </w:lvl>
+    <w:lvl w:ilvl="6" w:tplc="0C090001" w:tentative="1">
+      <w:start w:val="1"/>
+      <w:numFmt w:val="bullet"/>
+      <w:lvlText w:val=""/>
+      <w:lvlJc w:val="left"/>
+      <w:pPr>
+        <w:ind w:left="5040" w:hanging="360"/>
+      </w:pPr>
+      <w:rPr>
+        <w:rFonts w:ascii="Symbol" w:hAnsi="Symbol" w:hint="default"/>
+      </w:rPr>
+    </w:lvl>
+    <w:lvl w:ilvl="7" w:tplc="0C090003" w:tentative="1">
+      <w:start w:val="1"/>
+      <w:numFmt w:val="bullet"/>
+      <w:lvlText w:val="o"/>
+      <w:lvlJc w:val="left"/>
+      <w:pPr>
+        <w:ind w:left="5760" w:hanging="360"/>
+      </w:pPr>
+      <w:rPr>
+        <w:rFonts w:ascii="Courier New" w:hAnsi="Courier New" w:cs="Courier New" w:hint="default"/>
+      </w:rPr>
+    </w:lvl>
+    <w:lvl w:ilvl="8" w:tplc="0C090005" w:tentative="1">
+      <w:start w:val="1"/>
+      <w:numFmt w:val="bullet"/>
+      <w:lvlText w:val=""/>
+      <w:lvlJc w:val="left"/>
+      <w:pPr>
+        <w:ind w:left="6480" w:hanging="360"/>
+      </w:pPr>
+      <w:rPr>
+        <w:rFonts w:ascii="Wingdings" w:hAnsi="Wingdings" w:hint="default"/>
+      </w:rPr>
+    </w:lvl>
+  </w:abstractNum>
+  <w:abstractNum w:abstractNumId="4" w15:restartNumberingAfterBreak="0">
+    <w:nsid w:val="310F4631"/>
+    <w:multiLevelType w:val="hybridMultilevel"/>
+    <w:tmpl w:val="F9921D8A"/>
+    <w:lvl w:ilvl="0" w:tplc="0C090001">
+      <w:start w:val="1"/>
+      <w:numFmt w:val="bullet"/>
+      <w:lvlText w:val=""/>
+      <w:lvlJc w:val="left"/>
+      <w:pPr>
+        <w:ind w:left="720" w:hanging="360"/>
+      </w:pPr>
+      <w:rPr>
+        <w:rFonts w:ascii="Symbol" w:hAnsi="Symbol" w:hint="default"/>
+      </w:rPr>
+    </w:lvl>
+    <w:lvl w:ilvl="1" w:tplc="0C090003" w:tentative="1">
+      <w:start w:val="1"/>
+      <w:numFmt w:val="bullet"/>
+      <w:lvlText w:val="o"/>
+      <w:lvlJc w:val="left"/>
+      <w:pPr>
+        <w:ind w:left="1440" w:hanging="360"/>
+      </w:pPr>
+      <w:rPr>
+        <w:rFonts w:ascii="Courier New" w:hAnsi="Courier New" w:cs="Courier New" w:hint="default"/>
+      </w:rPr>
+    </w:lvl>
+    <w:lvl w:ilvl="2" w:tplc="0C090005" w:tentative="1">
+      <w:start w:val="1"/>
+      <w:numFmt w:val="bullet"/>
+      <w:lvlText w:val=""/>
+      <w:lvlJc w:val="left"/>
+      <w:pPr>
+        <w:ind w:left="2160" w:hanging="360"/>
+      </w:pPr>
+      <w:rPr>
+        <w:rFonts w:ascii="Wingdings" w:hAnsi="Wingdings" w:hint="default"/>
+      </w:rPr>
+    </w:lvl>
+    <w:lvl w:ilvl="3" w:tplc="0C090001" w:tentative="1">
+      <w:start w:val="1"/>
+      <w:numFmt w:val="bullet"/>
+      <w:lvlText w:val=""/>
+      <w:lvlJc w:val="left"/>
+      <w:pPr>
+        <w:ind w:left="2880" w:hanging="360"/>
+      </w:pPr>
+      <w:rPr>
+        <w:rFonts w:ascii="Symbol" w:hAnsi="Symbol" w:hint="default"/>
+      </w:rPr>
+    </w:lvl>
+    <w:lvl w:ilvl="4" w:tplc="0C090003" w:tentative="1">
+      <w:start w:val="1"/>
+      <w:numFmt w:val="bullet"/>
+      <w:lvlText w:val="o"/>
+      <w:lvlJc w:val="left"/>
+      <w:pPr>
+        <w:ind w:left="3600" w:hanging="360"/>
+      </w:pPr>
+      <w:rPr>
+        <w:rFonts w:ascii="Courier New" w:hAnsi="Courier New" w:cs="Courier New" w:hint="default"/>
+      </w:rPr>
+    </w:lvl>
+    <w:lvl w:ilvl="5" w:tplc="0C090005" w:tentative="1">
+      <w:start w:val="1"/>
+      <w:numFmt w:val="bullet"/>
+      <w:lvlText w:val=""/>
+      <w:lvlJc w:val="left"/>
+      <w:pPr>
+        <w:ind w:left="4320" w:hanging="360"/>
+      </w:pPr>
+      <w:rPr>
+        <w:rFonts w:ascii="Wingdings" w:hAnsi="Wingdings" w:hint="default"/>
+      </w:rPr>
+    </w:lvl>
+    <w:lvl w:ilvl="6" w:tplc="0C090001" w:tentative="1">
+      <w:start w:val="1"/>
+      <w:numFmt w:val="bullet"/>
+      <w:lvlText w:val=""/>
+      <w:lvlJc w:val="left"/>
+      <w:pPr>
+        <w:ind w:left="5040" w:hanging="360"/>
+      </w:pPr>
+      <w:rPr>
+        <w:rFonts w:ascii="Symbol" w:hAnsi="Symbol" w:hint="default"/>
+      </w:rPr>
+    </w:lvl>
+    <w:lvl w:ilvl="7" w:tplc="0C090003" w:tentative="1">
+      <w:start w:val="1"/>
+      <w:numFmt w:val="bullet"/>
+      <w:lvlText w:val="o"/>
+      <w:lvlJc w:val="left"/>
+      <w:pPr>
+        <w:ind w:left="5760" w:hanging="360"/>
+      </w:pPr>
+      <w:rPr>
+        <w:rFonts w:ascii="Courier New" w:hAnsi="Courier New" w:cs="Courier New" w:hint="default"/>
+      </w:rPr>
+    </w:lvl>
+    <w:lvl w:ilvl="8" w:tplc="0C090005" w:tentative="1">
+      <w:start w:val="1"/>
+      <w:numFmt w:val="bullet"/>
+      <w:lvlText w:val=""/>
+      <w:lvlJc w:val="left"/>
+      <w:pPr>
+        <w:ind w:left="6480" w:hanging="360"/>
+      </w:pPr>
+      <w:rPr>
+        <w:rFonts w:ascii="Wingdings" w:hAnsi="Wingdings" w:hint="default"/>
+      </w:rPr>
+    </w:lvl>
+  </w:abstractNum>
+  <w:abstractNum w:abstractNumId="5" w15:restartNumberingAfterBreak="0">
+    <w:nsid w:val="3A2028EC"/>
+    <w:multiLevelType w:val="hybridMultilevel"/>
+    <w:tmpl w:val="B74689CE"/>
+    <w:lvl w:ilvl="0" w:tplc="0C090001">
+      <w:start w:val="1"/>
+      <w:numFmt w:val="bullet"/>
+      <w:lvlText w:val=""/>
+      <w:lvlJc w:val="left"/>
+      <w:pPr>
+        <w:ind w:left="720" w:hanging="360"/>
+      </w:pPr>
+      <w:rPr>
+        <w:rFonts w:ascii="Symbol" w:hAnsi="Symbol" w:hint="default"/>
+      </w:rPr>
+    </w:lvl>
+    <w:lvl w:ilvl="1" w:tplc="0C090003" w:tentative="1">
+      <w:start w:val="1"/>
+      <w:numFmt w:val="bullet"/>
+      <w:lvlText w:val="o"/>
+      <w:lvlJc w:val="left"/>
+      <w:pPr>
+        <w:ind w:left="1440" w:hanging="360"/>
+      </w:pPr>
+      <w:rPr>
+        <w:rFonts w:ascii="Courier New" w:hAnsi="Courier New" w:cs="Courier New" w:hint="default"/>
+      </w:rPr>
+    </w:lvl>
+    <w:lvl w:ilvl="2" w:tplc="0C090005" w:tentative="1">
+      <w:start w:val="1"/>
+      <w:numFmt w:val="bullet"/>
+      <w:lvlText w:val=""/>
+      <w:lvlJc w:val="left"/>
+      <w:pPr>
+        <w:ind w:left="2160" w:hanging="360"/>
+      </w:pPr>
+      <w:rPr>
+        <w:rFonts w:ascii="Wingdings" w:hAnsi="Wingdings" w:hint="default"/>
+      </w:rPr>
+    </w:lvl>
+    <w:lvl w:ilvl="3" w:tplc="0C090001" w:tentative="1">
+      <w:start w:val="1"/>
+      <w:numFmt w:val="bullet"/>
+      <w:lvlText w:val=""/>
+      <w:lvlJc w:val="left"/>
+      <w:pPr>
+        <w:ind w:left="2880" w:hanging="360"/>
+      </w:pPr>
+      <w:rPr>
+        <w:rFonts w:ascii="Symbol" w:hAnsi="Symbol" w:hint="default"/>
+      </w:rPr>
+    </w:lvl>
+    <w:lvl w:ilvl="4" w:tplc="0C090003" w:tentative="1">
+      <w:start w:val="1"/>
+      <w:numFmt w:val="bullet"/>
+      <w:lvlText w:val="o"/>
+      <w:lvlJc w:val="left"/>
+      <w:pPr>
+        <w:ind w:left="3600" w:hanging="360"/>
+      </w:pPr>
+      <w:rPr>
+        <w:rFonts w:ascii="Courier New" w:hAnsi="Courier New" w:cs="Courier New" w:hint="default"/>
+      </w:rPr>
+    </w:lvl>
+    <w:lvl w:ilvl="5" w:tplc="0C090005" w:tentative="1">
+      <w:start w:val="1"/>
+      <w:numFmt w:val="bullet"/>
+      <w:lvlText w:val=""/>
+      <w:lvlJc w:val="left"/>
+      <w:pPr>
+        <w:ind w:left="4320" w:hanging="360"/>
+      </w:pPr>
+      <w:rPr>
+        <w:rFonts w:ascii="Wingdings" w:hAnsi="Wingdings" w:hint="default"/>
+      </w:rPr>
+    </w:lvl>
+    <w:lvl w:ilvl="6" w:tplc="0C090001" w:tentative="1">
+      <w:start w:val="1"/>
+      <w:numFmt w:val="bullet"/>
+      <w:lvlText w:val=""/>
+      <w:lvlJc w:val="left"/>
+      <w:pPr>
+        <w:ind w:left="5040" w:hanging="360"/>
+      </w:pPr>
+      <w:rPr>
+        <w:rFonts w:ascii="Symbol" w:hAnsi="Symbol" w:hint="default"/>
+      </w:rPr>
+    </w:lvl>
+    <w:lvl w:ilvl="7" w:tplc="0C090003" w:tentative="1">
+      <w:start w:val="1"/>
+      <w:numFmt w:val="bullet"/>
+      <w:lvlText w:val="o"/>
+      <w:lvlJc w:val="left"/>
+      <w:pPr>
+        <w:ind w:left="5760" w:hanging="360"/>
+      </w:pPr>
+      <w:rPr>
+        <w:rFonts w:ascii="Courier New" w:hAnsi="Courier New" w:cs="Courier New" w:hint="default"/>
+      </w:rPr>
+    </w:lvl>
+    <w:lvl w:ilvl="8" w:tplc="0C090005" w:tentative="1">
+      <w:start w:val="1"/>
+      <w:numFmt w:val="bullet"/>
+      <w:lvlText w:val=""/>
+      <w:lvlJc w:val="left"/>
+      <w:pPr>
+        <w:ind w:left="6480" w:hanging="360"/>
+      </w:pPr>
+      <w:rPr>
+        <w:rFonts w:ascii="Wingdings" w:hAnsi="Wingdings" w:hint="default"/>
+      </w:rPr>
+    </w:lvl>
+  </w:abstractNum>
+  <w:abstractNum w:abstractNumId="6" w15:restartNumberingAfterBreak="0">
     <w:nsid w:val="3B4D4585"/>
     <w:multiLevelType w:val="hybridMultilevel"/>
     <w:tmpl w:val="8584BEF8"/>
@@ -820,11 +2150,258 @@
       </w:rPr>
     </w:lvl>
   </w:abstractNum>
+  <w:abstractNum w:abstractNumId="7" w15:restartNumberingAfterBreak="0">
+    <w:nsid w:val="4332131A"/>
+    <w:multiLevelType w:val="hybridMultilevel"/>
+    <w:tmpl w:val="002CCF6A"/>
+    <w:lvl w:ilvl="0" w:tplc="0C090001">
+      <w:start w:val="1"/>
+      <w:numFmt w:val="bullet"/>
+      <w:lvlText w:val=""/>
+      <w:lvlJc w:val="left"/>
+      <w:pPr>
+        <w:ind w:left="720" w:hanging="360"/>
+      </w:pPr>
+      <w:rPr>
+        <w:rFonts w:ascii="Symbol" w:hAnsi="Symbol" w:hint="default"/>
+      </w:rPr>
+    </w:lvl>
+    <w:lvl w:ilvl="1" w:tplc="0C090003" w:tentative="1">
+      <w:start w:val="1"/>
+      <w:numFmt w:val="bullet"/>
+      <w:lvlText w:val="o"/>
+      <w:lvlJc w:val="left"/>
+      <w:pPr>
+        <w:ind w:left="1440" w:hanging="360"/>
+      </w:pPr>
+      <w:rPr>
+        <w:rFonts w:ascii="Courier New" w:hAnsi="Courier New" w:cs="Courier New" w:hint="default"/>
+      </w:rPr>
+    </w:lvl>
+    <w:lvl w:ilvl="2" w:tplc="0C090005" w:tentative="1">
+      <w:start w:val="1"/>
+      <w:numFmt w:val="bullet"/>
+      <w:lvlText w:val=""/>
+      <w:lvlJc w:val="left"/>
+      <w:pPr>
+        <w:ind w:left="2160" w:hanging="360"/>
+      </w:pPr>
+      <w:rPr>
+        <w:rFonts w:ascii="Wingdings" w:hAnsi="Wingdings" w:hint="default"/>
+      </w:rPr>
+    </w:lvl>
+    <w:lvl w:ilvl="3" w:tplc="0C090001" w:tentative="1">
+      <w:start w:val="1"/>
+      <w:numFmt w:val="bullet"/>
+      <w:lvlText w:val=""/>
+      <w:lvlJc w:val="left"/>
+      <w:pPr>
+        <w:ind w:left="2880" w:hanging="360"/>
+      </w:pPr>
+      <w:rPr>
+        <w:rFonts w:ascii="Symbol" w:hAnsi="Symbol" w:hint="default"/>
+      </w:rPr>
+    </w:lvl>
+    <w:lvl w:ilvl="4" w:tplc="0C090003" w:tentative="1">
+      <w:start w:val="1"/>
+      <w:numFmt w:val="bullet"/>
+      <w:lvlText w:val="o"/>
+      <w:lvlJc w:val="left"/>
+      <w:pPr>
+        <w:ind w:left="3600" w:hanging="360"/>
+      </w:pPr>
+      <w:rPr>
+        <w:rFonts w:ascii="Courier New" w:hAnsi="Courier New" w:cs="Courier New" w:hint="default"/>
+      </w:rPr>
+    </w:lvl>
+    <w:lvl w:ilvl="5" w:tplc="0C090005" w:tentative="1">
+      <w:start w:val="1"/>
+      <w:numFmt w:val="bullet"/>
+      <w:lvlText w:val=""/>
+      <w:lvlJc w:val="left"/>
+      <w:pPr>
+        <w:ind w:left="4320" w:hanging="360"/>
+      </w:pPr>
+      <w:rPr>
+        <w:rFonts w:ascii="Wingdings" w:hAnsi="Wingdings" w:hint="default"/>
+      </w:rPr>
+    </w:lvl>
+    <w:lvl w:ilvl="6" w:tplc="0C090001" w:tentative="1">
+      <w:start w:val="1"/>
+      <w:numFmt w:val="bullet"/>
+      <w:lvlText w:val=""/>
+      <w:lvlJc w:val="left"/>
+      <w:pPr>
+        <w:ind w:left="5040" w:hanging="360"/>
+      </w:pPr>
+      <w:rPr>
+        <w:rFonts w:ascii="Symbol" w:hAnsi="Symbol" w:hint="default"/>
+      </w:rPr>
+    </w:lvl>
+    <w:lvl w:ilvl="7" w:tplc="0C090003" w:tentative="1">
+      <w:start w:val="1"/>
+      <w:numFmt w:val="bullet"/>
+      <w:lvlText w:val="o"/>
+      <w:lvlJc w:val="left"/>
+      <w:pPr>
+        <w:ind w:left="5760" w:hanging="360"/>
+      </w:pPr>
+      <w:rPr>
+        <w:rFonts w:ascii="Courier New" w:hAnsi="Courier New" w:cs="Courier New" w:hint="default"/>
+      </w:rPr>
+    </w:lvl>
+    <w:lvl w:ilvl="8" w:tplc="0C090005" w:tentative="1">
+      <w:start w:val="1"/>
+      <w:numFmt w:val="bullet"/>
+      <w:lvlText w:val=""/>
+      <w:lvlJc w:val="left"/>
+      <w:pPr>
+        <w:ind w:left="6480" w:hanging="360"/>
+      </w:pPr>
+      <w:rPr>
+        <w:rFonts w:ascii="Wingdings" w:hAnsi="Wingdings" w:hint="default"/>
+      </w:rPr>
+    </w:lvl>
+  </w:abstractNum>
+  <w:abstractNum w:abstractNumId="8" w15:restartNumberingAfterBreak="0">
+    <w:nsid w:val="5D6A6AE3"/>
+    <w:multiLevelType w:val="hybridMultilevel"/>
+    <w:tmpl w:val="B8482294"/>
+    <w:lvl w:ilvl="0" w:tplc="0C090001">
+      <w:start w:val="1"/>
+      <w:numFmt w:val="bullet"/>
+      <w:lvlText w:val=""/>
+      <w:lvlJc w:val="left"/>
+      <w:pPr>
+        <w:ind w:left="720" w:hanging="360"/>
+      </w:pPr>
+      <w:rPr>
+        <w:rFonts w:ascii="Symbol" w:hAnsi="Symbol" w:hint="default"/>
+      </w:rPr>
+    </w:lvl>
+    <w:lvl w:ilvl="1" w:tplc="0C090003" w:tentative="1">
+      <w:start w:val="1"/>
+      <w:numFmt w:val="bullet"/>
+      <w:lvlText w:val="o"/>
+      <w:lvlJc w:val="left"/>
+      <w:pPr>
+        <w:ind w:left="1440" w:hanging="360"/>
+      </w:pPr>
+      <w:rPr>
+        <w:rFonts w:ascii="Courier New" w:hAnsi="Courier New" w:cs="Courier New" w:hint="default"/>
+      </w:rPr>
+    </w:lvl>
+    <w:lvl w:ilvl="2" w:tplc="0C090005" w:tentative="1">
+      <w:start w:val="1"/>
+      <w:numFmt w:val="bullet"/>
+      <w:lvlText w:val=""/>
+      <w:lvlJc w:val="left"/>
+      <w:pPr>
+        <w:ind w:left="2160" w:hanging="360"/>
+      </w:pPr>
+      <w:rPr>
+        <w:rFonts w:ascii="Wingdings" w:hAnsi="Wingdings" w:hint="default"/>
+      </w:rPr>
+    </w:lvl>
+    <w:lvl w:ilvl="3" w:tplc="0C090001" w:tentative="1">
+      <w:start w:val="1"/>
+      <w:numFmt w:val="bullet"/>
+      <w:lvlText w:val=""/>
+      <w:lvlJc w:val="left"/>
+      <w:pPr>
+        <w:ind w:left="2880" w:hanging="360"/>
+      </w:pPr>
+      <w:rPr>
+        <w:rFonts w:ascii="Symbol" w:hAnsi="Symbol" w:hint="default"/>
+      </w:rPr>
+    </w:lvl>
+    <w:lvl w:ilvl="4" w:tplc="0C090003" w:tentative="1">
+      <w:start w:val="1"/>
+      <w:numFmt w:val="bullet"/>
+      <w:lvlText w:val="o"/>
+      <w:lvlJc w:val="left"/>
+      <w:pPr>
+        <w:ind w:left="3600" w:hanging="360"/>
+      </w:pPr>
+      <w:rPr>
+        <w:rFonts w:ascii="Courier New" w:hAnsi="Courier New" w:cs="Courier New" w:hint="default"/>
+      </w:rPr>
+    </w:lvl>
+    <w:lvl w:ilvl="5" w:tplc="0C090005" w:tentative="1">
+      <w:start w:val="1"/>
+      <w:numFmt w:val="bullet"/>
+      <w:lvlText w:val=""/>
+      <w:lvlJc w:val="left"/>
+      <w:pPr>
+        <w:ind w:left="4320" w:hanging="360"/>
+      </w:pPr>
+      <w:rPr>
+        <w:rFonts w:ascii="Wingdings" w:hAnsi="Wingdings" w:hint="default"/>
+      </w:rPr>
+    </w:lvl>
+    <w:lvl w:ilvl="6" w:tplc="0C090001" w:tentative="1">
+      <w:start w:val="1"/>
+      <w:numFmt w:val="bullet"/>
+      <w:lvlText w:val=""/>
+      <w:lvlJc w:val="left"/>
+      <w:pPr>
+        <w:ind w:left="5040" w:hanging="360"/>
+      </w:pPr>
+      <w:rPr>
+        <w:rFonts w:ascii="Symbol" w:hAnsi="Symbol" w:hint="default"/>
+      </w:rPr>
+    </w:lvl>
+    <w:lvl w:ilvl="7" w:tplc="0C090003" w:tentative="1">
+      <w:start w:val="1"/>
+      <w:numFmt w:val="bullet"/>
+      <w:lvlText w:val="o"/>
+      <w:lvlJc w:val="left"/>
+      <w:pPr>
+        <w:ind w:left="5760" w:hanging="360"/>
+      </w:pPr>
+      <w:rPr>
+        <w:rFonts w:ascii="Courier New" w:hAnsi="Courier New" w:cs="Courier New" w:hint="default"/>
+      </w:rPr>
+    </w:lvl>
+    <w:lvl w:ilvl="8" w:tplc="0C090005" w:tentative="1">
+      <w:start w:val="1"/>
+      <w:numFmt w:val="bullet"/>
+      <w:lvlText w:val=""/>
+      <w:lvlJc w:val="left"/>
+      <w:pPr>
+        <w:ind w:left="6480" w:hanging="360"/>
+      </w:pPr>
+      <w:rPr>
+        <w:rFonts w:ascii="Wingdings" w:hAnsi="Wingdings" w:hint="default"/>
+      </w:rPr>
+    </w:lvl>
+  </w:abstractNum>
   <w:num w:numId="1" w16cid:durableId="72822676">
+    <w:abstractNumId w:val="1"/>
+  </w:num>
+  <w:num w:numId="2" w16cid:durableId="1373535972">
+    <w:abstractNumId w:val="6"/>
+  </w:num>
+  <w:num w:numId="3" w16cid:durableId="1384669415">
+    <w:abstractNumId w:val="5"/>
+  </w:num>
+  <w:num w:numId="4" w16cid:durableId="1708673365">
+    <w:abstractNumId w:val="2"/>
+  </w:num>
+  <w:num w:numId="5" w16cid:durableId="758209459">
+    <w:abstractNumId w:val="3"/>
+  </w:num>
+  <w:num w:numId="6" w16cid:durableId="317657243">
+    <w:abstractNumId w:val="7"/>
+  </w:num>
+  <w:num w:numId="7" w16cid:durableId="1204176463">
     <w:abstractNumId w:val="0"/>
   </w:num>
-  <w:num w:numId="2" w16cid:durableId="1373535972">
-    <w:abstractNumId w:val="1"/>
+  <w:num w:numId="8" w16cid:durableId="212665932">
+    <w:abstractNumId w:val="4"/>
+  </w:num>
+  <w:num w:numId="9" w16cid:durableId="97258445">
+    <w:abstractNumId w:val="8"/>
   </w:num>
 </w:numbering>
 </file>
@@ -1432,6 +3009,7 @@
   <w:style w:type="character" w:default="1" w:styleId="DefaultParagraphFont">
     <w:name w:val="Default Paragraph Font"/>
     <w:uiPriority w:val="1"/>
+    <w:semiHidden/>
     <w:unhideWhenUsed/>
   </w:style>
   <w:style w:type="table" w:default="1" w:styleId="TableNormal">

</xml_diff>

<commit_message>
Added V2 PCB Design and updated logbook
</commit_message>
<xml_diff>
--- a/Onboarding Project Research.docx
+++ b/Onboarding Project Research.docx
@@ -561,21 +561,7 @@
         <w:rPr>
           <w:lang w:val="en-GB"/>
         </w:rPr>
-        <w:t xml:space="preserve">Similar low current draw to </w:t>
-      </w:r>
-      <w:proofErr w:type="gramStart"/>
-      <w:r>
-        <w:rPr>
-          <w:lang w:val="en-GB"/>
-        </w:rPr>
-        <w:t>other</w:t>
-      </w:r>
-      <w:proofErr w:type="gramEnd"/>
-      <w:r>
-        <w:rPr>
-          <w:lang w:val="en-GB"/>
-        </w:rPr>
-        <w:t xml:space="preserve"> NAND Package</w:t>
+        <w:t>Similar low current draw to other NAND Package</w:t>
       </w:r>
     </w:p>
     <w:p>
@@ -820,21 +806,7 @@
         <w:rPr>
           <w:lang w:val="en-GB"/>
         </w:rPr>
-        <w:t xml:space="preserve">Higher </w:t>
-      </w:r>
-      <w:proofErr w:type="gramStart"/>
-      <w:r>
-        <w:rPr>
-          <w:lang w:val="en-GB"/>
-        </w:rPr>
-        <w:t>16 bit</w:t>
-      </w:r>
-      <w:proofErr w:type="gramEnd"/>
-      <w:r>
-        <w:rPr>
-          <w:lang w:val="en-GB"/>
-        </w:rPr>
-        <w:t xml:space="preserve"> bus width</w:t>
+        <w:t>Higher 16 bit bus width</w:t>
       </w:r>
     </w:p>
     <w:p>
@@ -1217,14 +1189,12 @@
         </w:rPr>
         <w:t xml:space="preserve">, when looking into these different microcontrollers, the ESP32-WROOM modules stood out due to their easy to use design, having a variety of needed parts built in such as USB to serial conversion and flash memory for the program being run, this however made them more expensive than alternative options, the RP family from raspberry pi stood out for its fantastic documentation including minimal reference designs and PCB layout examples. </w:t>
       </w:r>
-      <w:proofErr w:type="gramStart"/>
-      <w:r>
-        <w:rPr>
-          <w:lang w:val="en-GB"/>
-        </w:rPr>
-        <w:t>Finally</w:t>
-      </w:r>
-      <w:proofErr w:type="gramEnd"/>
+      <w:r>
+        <w:rPr>
+          <w:lang w:val="en-GB"/>
+        </w:rPr>
+        <w:t>Finally,</w:t>
+      </w:r>
       <w:r>
         <w:rPr>
           <w:lang w:val="en-GB"/>
@@ -1246,14 +1216,12 @@
         </w:rPr>
         <w:t xml:space="preserve"> due to </w:t>
       </w:r>
-      <w:proofErr w:type="spellStart"/>
-      <w:r>
-        <w:rPr>
-          <w:lang w:val="en-GB"/>
-        </w:rPr>
-        <w:t>it’s</w:t>
-      </w:r>
-      <w:proofErr w:type="spellEnd"/>
+      <w:r>
+        <w:rPr>
+          <w:lang w:val="en-GB"/>
+        </w:rPr>
+        <w:t>its</w:t>
+      </w:r>
       <w:r>
         <w:rPr>
           <w:lang w:val="en-GB"/>

</xml_diff>